<commit_message>
Update resume and index.html to include location details for job experiences
</commit_message>
<xml_diff>
--- a/PORTFOLIO/PORTO CONTENT/Sumit Kumar Resume.docx
+++ b/PORTFOLIO/PORTO CONTENT/Sumit Kumar Resume.docx
@@ -278,7 +278,7 @@
           <w:i/>
           <w:sz w:val="21"/>
         </w:rPr>
-        <w:t>Panipat, India</w:t>
+        <w:t>Mohali, India</w:t>
       </w:r>
       <w:r>
         <w:tab/>
@@ -356,7 +356,7 @@
           <w:i/>
           <w:sz w:val="21"/>
         </w:rPr>
-        <w:t>Remote</w:t>
+        <w:t>Mohali, India</w:t>
       </w:r>
       <w:r>
         <w:tab/>
@@ -434,7 +434,7 @@
           <w:i/>
           <w:sz w:val="21"/>
         </w:rPr>
-        <w:t>Panipat, India</w:t>
+        <w:t>Panchkula, India</w:t>
       </w:r>
       <w:r>
         <w:tab/>

</xml_diff>